<commit_message>
Documentación: consulta editable y ficha en modal
El manual técnico describe el contrato { filas, consulta }, los endpoints
POST de ejecución de solo lectura con límite y timeout, y las clases y
componentes añadidos para el editor y el modal. El diagrama de clases
incorpora ConsultaEditorService, QueryView, QueryResult,
CustomQueryRequest, ConsultaEjecutada y Modal, y el SVG se regenera a
partir del fuente.
</commit_message>
<xml_diff>
--- a/documentacion/manual_tecnico.docx
+++ b/documentacion/manual_tecnico.docx
@@ -2179,6 +2179,14 @@
         <w:pStyle w:val="ListBullet"/>
       </w:pPr>
       <w:r>
+        <w:t>El editor de consultas ejecutadas aplica solo lectura, un límite de 200 filas y 10 segundos; no sustituye autenticación ni autorización y debe restringirse antes de exponer la API.</w:t>
+      </w:r>
+    </w:p>
+    <w:p>
+      <w:pPr>
+        <w:pStyle w:val="ListBullet"/>
+      </w:pPr>
+      <w:r>
         <w:t>No guardar datos originales o rechazados reales en Git. Sanitizar logs y reportes antes de compartirlos.</w:t>
       </w:r>
     </w:p>
@@ -2816,6 +2824,59 @@
     <w:p>
       <w:r>
         <w:t>La biblioteca MongoDB admite JSON estructurado (find, aggregate, insertMany, updateMany y deleteMany), no JavaScript mongosh; limita colecciones a evaluaciones, aspirantes y resumen_carrera y bloquea operadores de ejecución de JavaScript. Neo4j admite una sentencia de datos, sin administración ni procedimientos; EXPLAIN valida y clasifica antes de guardar/ejecutar. Las escrituras requieren además confirmación explícita. No constituyen un sandbox general para usuarios no confiables.</w:t>
+      </w:r>
+    </w:p>
+    <w:p>
+      <w:pPr>
+        <w:pStyle w:val="Heading2"/>
+      </w:pPr>
+      <w:r>
+        <w:t>8.1 Consulta ejecutada y ejecución editada</w:t>
+      </w:r>
+    </w:p>
+    <w:p>
+      <w:r>
+        <w:t>Las consultas analíticas GET /api/consultas/mongo/{1..20} y GET /api/grafo/consultas/{1..7} responden con { filas, consulta }. El arreglo filas alimenta la tabla o gráfica y consulta es un objeto QueryView con motor, codigo, nota opcional y parametros, este último solo en Cypher. El cliente muestra esa consulta al final del resultado.</w:t>
+      </w:r>
+    </w:p>
+    <w:p>
+      <w:r>
+        <w:t>El visor permite editar codigo y volver a ejecutarlo contra POST /api/consultas/mongo/ejecutar (cuerpo { codigo }) o POST /api/grafo/ejecutar (cuerpo { codigo, parametros }). Ambos endpoints aceptan solo lectura, aplican un máximo de 200 filas y un timeout de 10 segundos por defecto, y responden { filas, truncado, limiteFilas, duracionMs }. El resultado editado se muestra en una tabla aparte sin reemplazar la visualización original.</w:t>
+      </w:r>
+    </w:p>
+    <w:p>
+      <w:r>
+        <w:t>En MongoDB, codigo debe ser un objeto JSON con operacion find o aggregate; se rechazan $out, $merge, insertMany, updateMany, deleteMany y las colecciones fuera de evaluaciones, aspirantes y resumen_carrera. En Cypher se admite una sola sentencia de datos sin CALL ni administración; parametros conserva los valores originales, incluidos los nulos.</w:t>
+      </w:r>
+    </w:p>
+    <w:p>
+      <w:r>
+        <w:t>curl -X POST -H 'Content-Type: application/json' \</w:t>
+      </w:r>
+    </w:p>
+    <w:p>
+      <w:r>
+        <w:t xml:space="preserve">  -d '{"codigo":"{\"operacion\":\"find\",\"coleccion\":\"aspirantes\",\"filtro\":{}}"}' \</w:t>
+      </w:r>
+    </w:p>
+    <w:p>
+      <w:r>
+        <w:t xml:space="preserve">  http://localhost:8080/api/consultas/mongo/ejecutar</w:t>
+      </w:r>
+    </w:p>
+    <w:p>
+      <w:r>
+        <w:t>curl -X POST -H 'Content-Type: application/json' \</w:t>
+      </w:r>
+    </w:p>
+    <w:p>
+      <w:r>
+        <w:t xml:space="preserve">  -d '{"codigo":"MATCH (m:Materia) RETURN m.nombre AS materia LIMIT $limite","parametros":{"limite":5}}' \</w:t>
+      </w:r>
+    </w:p>
+    <w:p>
+      <w:r>
+        <w:t xml:space="preserve">  http://localhost:8080/api/grafo/ejecutar</w:t>
       </w:r>
     </w:p>
     <w:p>
@@ -4232,7 +4293,7 @@
     </w:p>
     <w:p>
       <w:r>
-        <w:t>Adaptador REST de búsqueda, ficha de aspirante e historial.</w:t>
+        <w:t>Adaptador REST de búsqueda, ficha de aspirante e historial; el término vacío devuelve un listado general acotado.</w:t>
       </w:r>
     </w:p>
     <w:p>
@@ -4642,12 +4703,12 @@
     </w:p>
     <w:p>
       <w:r>
-        <w:t>Expone consultas analíticas numeradas y regeneración de resumen de carreras.</w:t>
-      </w:r>
-    </w:p>
-    <w:p>
-      <w:r>
-        <w:t>Referencias/estado principales: MongoQueryService queryService.</w:t>
+        <w:t>Expone consultas analíticas numeradas, la consulta ejecutada, el resumen de carreras y la ejecución editada de solo lectura.</w:t>
+      </w:r>
+    </w:p>
+    <w:p>
+      <w:r>
+        <w:t>Referencias/estado principales: MongoQueryService queryService; ConsultaEditorService editorService.</w:t>
       </w:r>
     </w:p>
     <w:tbl>
@@ -4764,12 +4825,12 @@
     </w:p>
     <w:p>
       <w:r>
-        <w:t>Expone consultas Cypher, visualización y detalle de nodos.</w:t>
-      </w:r>
-    </w:p>
-    <w:p>
-      <w:r>
-        <w:t>Referencias/estado principales: GraphService graphService.</w:t>
+        <w:t>Expone consultas Cypher con su sentencia y parámetros, visualización, detalle de nodos y ejecución editada de solo lectura.</w:t>
+      </w:r>
+    </w:p>
+    <w:p>
+      <w:r>
+        <w:t>Referencias/estado principales: GraphService graphService; ConsultaEditorService editorService.</w:t>
       </w:r>
     </w:p>
     <w:tbl>
@@ -5203,6 +5264,30 @@
         <w:pStyle w:val="Heading2"/>
       </w:pPr>
       <w:r>
+        <w:t>CustomQueryRequest</w:t>
+      </w:r>
+    </w:p>
+    <w:p>
+      <w:r>
+        <w:t>Archivo: proyecto-final-db2/src/main/java/com/db2/proyectofinaldb2/dto/CustomQueryRequest.java</w:t>
+      </w:r>
+    </w:p>
+    <w:p>
+      <w:r>
+        <w:t>Record de entrada para ejecutar una versión editada de una consulta; no guarda estado ni credenciales.</w:t>
+      </w:r>
+    </w:p>
+    <w:p>
+      <w:r>
+        <w:t>Record CustomQueryRequest: String codigo, Map&lt;String, Object&gt; parametros. Constructor canónico y accesores implícitos de Java.</w:t>
+      </w:r>
+    </w:p>
+    <w:p/>
+    <w:p>
+      <w:pPr>
+        <w:pStyle w:val="Heading2"/>
+      </w:pPr>
+      <w:r>
         <w:t>GrafoDto</w:t>
       </w:r>
     </w:p>
@@ -5231,6 +5316,59 @@
         <w:t>Record Relacion: String id, String source, String target, String tipo, Map&lt;String, Object&gt; propiedades. Constructor canónico y accesores implícitos de Java.</w:t>
       </w:r>
     </w:p>
+    <w:p>
+      <w:pPr>
+        <w:pStyle w:val="Heading2"/>
+      </w:pPr>
+      <w:r>
+        <w:t>QueryResult</w:t>
+      </w:r>
+    </w:p>
+    <w:p>
+      <w:r>
+        <w:t>Archivo: proyecto-final-db2/src/main/java/com/db2/proyectofinaldb2/dto/QueryResult.java</w:t>
+      </w:r>
+    </w:p>
+    <w:p>
+      <w:r>
+        <w:t>Resultado de una consulta analítica: las filas y la consulta ejecutada que se muestra al usuario.</w:t>
+      </w:r>
+    </w:p>
+    <w:p>
+      <w:r>
+        <w:t>Record QueryResult: List&lt;Map&lt;String, Object&gt;&gt; filas, QueryView consulta. Constructor canónico y accesores implícitos de Java.</w:t>
+      </w:r>
+    </w:p>
+    <w:p/>
+    <w:p>
+      <w:pPr>
+        <w:pStyle w:val="Heading2"/>
+      </w:pPr>
+      <w:r>
+        <w:t>QueryView</w:t>
+      </w:r>
+    </w:p>
+    <w:p>
+      <w:r>
+        <w:t>Archivo: proyecto-final-db2/src/main/java/com/db2/proyectofinaldb2/dto/QueryView.java</w:t>
+      </w:r>
+    </w:p>
+    <w:p>
+      <w:r>
+        <w:t>Contrato de la consulta ejecutada, editable en el cliente; conserva los parámetros Cypher nulos de forma explícita.</w:t>
+      </w:r>
+    </w:p>
+    <w:p>
+      <w:r>
+        <w:t>Record QueryView: String motor, String codigo, String nota, Map&lt;String, Object&gt; parametros. Constructor canónico y accesores implícitos de Java.</w:t>
+      </w:r>
+    </w:p>
+    <w:p>
+      <w:r>
+        <w:t>La anotación JsonInclude(ALWAYS) sobre parametros evita que se omitan claves con valor null, necesarias para reenviar la misma sentencia sin que Neo4j falle por parámetros faltantes.</w:t>
+      </w:r>
+    </w:p>
+    <w:p/>
     <w:p>
       <w:pPr>
         <w:pStyle w:val="Heading2"/>
@@ -7136,6 +7274,36 @@
         <w:t>Referencias/estado principales: EvaluationRepository repository.</w:t>
       </w:r>
     </w:p>
+    <w:p/>
+    <w:p>
+      <w:pPr>
+        <w:pStyle w:val="Heading2"/>
+      </w:pPr>
+      <w:r>
+        <w:t>ConsultaEditorService</w:t>
+      </w:r>
+    </w:p>
+    <w:p>
+      <w:r>
+        <w:t>Archivo: proyecto-final-db2/src/main/java/com/db2/proyectofinaldb2/service/ConsultaEditorService.java</w:t>
+      </w:r>
+    </w:p>
+    <w:p>
+      <w:r>
+        <w:t>Ejecuta versiones editadas de consultas con política de solo lectura, límite de filas y timeout.</w:t>
+      </w:r>
+    </w:p>
+    <w:p>
+      <w:r>
+        <w:t>Referencias/estado principales: MongoTemplate mongo; Driver driver; CustomQueryPolicy policy; int maxRows; int timeout.</w:t>
+      </w:r>
+    </w:p>
+    <w:p>
+      <w:r>
+        <w:t>Métodos principales: executeMongo(String codigo): Map y executeNeo4j(String codigo, Map&lt;String, Object&gt; parametros): Map. Ambos devuelven filas, truncado, limiteFilas y duracionMs; las escrituras, colecciones no permitidas y errores de sintaxis se rechazan con ApiException.</w:t>
+      </w:r>
+    </w:p>
+    <w:p/>
     <w:tbl>
       <w:tblPr>
         <w:tblW w:type="auto" w:w="0"/>
@@ -7278,7 +7446,6 @@
         </w:tc>
       </w:tr>
     </w:tbl>
-    <w:p/>
     <w:p>
       <w:pPr>
         <w:pStyle w:val="Heading2"/>
@@ -7709,7 +7876,7 @@
     </w:p>
     <w:p>
       <w:r>
-        <w:t>Lee Cypher con filtros; transforma nodos y relaciones del driver al DTO de grafo.</w:t>
+        <w:t>Lee Cypher con filtros, transforma nodos y relaciones al DTO de grafo y expone la sentencia con sus parámetros en runQueryWithPlan.</w:t>
       </w:r>
     </w:p>
     <w:p>
@@ -8029,7 +8196,7 @@
     </w:p>
     <w:p>
       <w:r>
-        <w:t>Implementa las veinte consultas analíticas mediante pipelines y filtros compartidos.</w:t>
+        <w:t>Implementa las veinte consultas analíticas mediante pipelines y filtros compartidos; executeWithPlan devuelve filas y la consulta ejecutada.</w:t>
       </w:r>
     </w:p>
     <w:p>
@@ -8040,6 +8207,11 @@
     <w:p>
       <w:r>
         <w:t>Record QueryFilters: Integer anio, String materia, String carrera, String depto, String tipo, Integer limit, String correlativo. Constructor canónico y accesores implícitos de Java.</w:t>
+      </w:r>
+    </w:p>
+    <w:p>
+      <w:r>
+        <w:t>La consulta visible se representa como find en C11 y C15, como aggregate en el resto y con una nota en C6 porque la lectura de resumen_carrera se regenera con $merge.</w:t>
       </w:r>
     </w:p>
     <w:tbl>
@@ -9026,7 +9198,7 @@
     </w:p>
     <w:p>
       <w:r>
-        <w:t>Búsqueda por tipos, fichas e historial usando filtros y expresiones regulares escapadas.</w:t>
+        <w:t>Búsqueda por tipos, fichas e historial; el término vacío lista hasta 50 aspirantes ordenados por identificador.</w:t>
       </w:r>
     </w:p>
     <w:p>
@@ -10219,6 +10391,30 @@
         <w:pStyle w:val="Heading2"/>
       </w:pPr>
       <w:r>
+        <w:t>src/components/ConsultaEjecutada.jsx</w:t>
+      </w:r>
+    </w:p>
+    <w:p>
+      <w:r>
+        <w:t>Visor y editor de la consulta ejecutada al final de cada gráfica o tabla. Ejecuta la versión editada solo en lectura y muestra su resultado en una tabla aparte.</w:t>
+      </w:r>
+    </w:p>
+    <w:p>
+      <w:r>
+        <w:t>Dependencias importadas: react, ../api/client, ./TablaResultados, ../utils/formato.</w:t>
+      </w:r>
+    </w:p>
+    <w:p>
+      <w:r>
+        <w:t>Estado y acciones: codigo, abierto, ejecutando, error y resultado; ejecutar valida el JSON en MongoDB, restaurar recupera la sentencia original y el resultado editado no reemplaza la visualización original.</w:t>
+      </w:r>
+    </w:p>
+    <w:p/>
+    <w:p>
+      <w:pPr>
+        <w:pStyle w:val="Heading2"/>
+      </w:pPr>
+      <w:r>
         <w:t>src/components/ConsultasGuardadas.jsx</w:t>
       </w:r>
     </w:p>
@@ -10808,6 +11004,30 @@
         <w:pStyle w:val="Heading2"/>
       </w:pPr>
       <w:r>
+        <w:t>src/components/Modal.jsx</w:t>
+      </w:r>
+    </w:p>
+    <w:p>
+      <w:r>
+        <w:t>Diálogo accesible reutilizable con título, subtítulo y contenido; cierra con Escape, clic fuera o el botón de la cabecera.</w:t>
+      </w:r>
+    </w:p>
+    <w:p>
+      <w:r>
+        <w:t>Dependencias importadas: react.</w:t>
+      </w:r>
+    </w:p>
+    <w:p>
+      <w:r>
+        <w:t>Bloquea el scroll del documento mientras está abierto y restaura el valor previo al desmontar.</w:t>
+      </w:r>
+    </w:p>
+    <w:p/>
+    <w:p>
+      <w:pPr>
+        <w:pStyle w:val="Heading2"/>
+      </w:pPr>
+      <w:r>
         <w:t>src/components/TablaResultados.jsx</w:t>
       </w:r>
     </w:p>
@@ -11101,7 +11321,7 @@
     </w:p>
     <w:p>
       <w:r>
-        <w:t>Gestiona parámetros, carga/error y recarga de consulta; permite regenerar resumen C6.</w:t>
+        <w:t>Gestiona parámetros, carga/error y recarga de consulta; conserva la consulta ejecutada para el editor y permite regenerar el resumen C6.</w:t>
       </w:r>
     </w:p>
     <w:tbl>
@@ -11192,7 +11412,7 @@
     </w:p>
     <w:p>
       <w:r>
-        <w:t>Busca por tipo y texto; consulta ficha e historial mediante ID codificado; muestra FichaAspirante.</w:t>
+        <w:t>Busca por tipo y texto; q vacío lista hasta 50 resultados. Abre la ficha y el historial en un modal reutilizable.</w:t>
       </w:r>
     </w:p>
     <w:tbl>
@@ -11250,7 +11470,7 @@
     <w:p/>
     <w:p>
       <w:r>
-        <w:t>Dependencias importadas: react, ../api/client, ../components/TablaResultados, ../components/Cargando, ../components/EstadoError, ../utils/formato, ../components/FichaAspirante.</w:t>
+        <w:t>Dependencias importadas: react, ../api/client, ../components/TablaResultados, ../components/Cargando, ../components/EstadoError, ../utils/formato, ../components/FichaAspirante, ../components/Modal.</w:t>
       </w:r>
     </w:p>
     <w:p>
@@ -11339,7 +11559,7 @@
     </w:p>
     <w:p>
       <w:r>
-        <w:t>Catálogo de 20 consultas, filtros, ejecución con hook, tabla/gráfica y ficha completa en C15; biblioteca administrativa integrada.</w:t>
+        <w:t>Catálogo de 20 consultas, filtros, ejecución con hook, tabla/gráfica, editor de la consulta ejecutada y ficha completa en C15; biblioteca administrativa integrada.</w:t>
       </w:r>
     </w:p>
     <w:tbl>
@@ -11397,7 +11617,7 @@
     <w:p/>
     <w:p>
       <w:r>
-        <w:t>Dependencias importadas: react, ../components/Grafica, ../components/TablaResultados, ../components/Cargando, ../components/EstadoError, ../components/FiltroBar, ../hooks/useConsultas, ../hooks/useCatalogos, ../components/ConsultasGuardadas, ../components/FichaAspirante, ../utils/formato.</w:t>
+        <w:t>Dependencias importadas: react, ../components/Grafica, ../components/TablaResultados, ../components/Cargando, ../components/EstadoError, ../components/FiltroBar, ../hooks/useConsultas, ../hooks/useCatalogos, ../components/ConsultasGuardadas, ../components/ConsultaEjecutada, ../components/FichaAspirante, ../utils/formato.</w:t>
       </w:r>
     </w:p>
     <w:p>
@@ -11552,7 +11772,7 @@
     </w:p>
     <w:p>
       <w:r>
-        <w:t>Visualización filtrada, consulta G1..G7, inspección de nodo y tabla; usa grafo interactivo y consultas guardadas.</w:t>
+        <w:t>Visualización filtrada, consultas G1..G7 con su sentencia Cypher y parámetros, inspección de nodo y tabla; editor de la consulta ejecutada y consultas guardadas.</w:t>
       </w:r>
     </w:p>
     <w:tbl>
@@ -11610,7 +11830,7 @@
     <w:p/>
     <w:p>
       <w:r>
-        <w:t>Dependencias importadas: react, ../api/client, ../components/GrafoCanvas, ../components/TablaResultados, ../components/Cargando, ../components/EstadoError, ../components/FiltroBar, ../hooks/useCatalogos, ../components/ConsultasGuardadas, ../utils/formato.</w:t>
+        <w:t>Dependencias importadas: react, ../api/client, ../components/GrafoCanvas, ../components/TablaResultados, ../components/Cargando, ../components/EstadoError, ../components/FiltroBar, ../hooks/useCatalogos, ../components/ConsultasGuardadas, ../components/ConsultaEjecutada, ../utils/formato.</w:t>
       </w:r>
     </w:p>
     <w:p>
@@ -12052,7 +12272,7 @@
     </w:p>
     <w:p>
       <w:r>
-        <w:t>Pruebas Java presentes localmente: 38 unitarias aprobadas en la última tanda documentada, y una integración MongoQueryIntegrationTest opcional que requiere TEST_MONGO_URI y usa una base temporal aislada eliminada al finalizar. Frontend: 10 pruebas de normalización CSV con node:test. Los resultados son evidencia histórica, no sustituyen ejecutar la suite en cada entorno. Este manual no implica haber repetido conexiones a las bases ni cargas de datos.</w:t>
+        <w:t>Pruebas Java presentes localmente: 40 casos en la última tanda, 39 aprobados y una integración MongoQueryIntegrationTest omitida que requiere TEST_MONGO_URI y usa una base temporal aislada eliminada al finalizar. Frontend: 10 pruebas de normalización CSV con node:test. Los resultados son evidencia histórica, no sustituyen ejecutar la suite en cada entorno. Este manual no implica haber repetido conexiones a las bases ni cargas de datos.</w:t>
       </w:r>
     </w:p>
     <w:p>

</xml_diff>